<commit_message>
Write Word property children in OOXML schema order
Built-in templates and exports appended pBdr, shd, tblBorders, tcBorders,
tcMar and settings/updateFields at the end of their parents, which the
OpenXML SDK validator rejects. Add briefloop.ooxml_order with the ECMA-376
sequences for the parents we touch, route the export helpers and the
template build script through it, add w:val="clear" to cell shading, and
regenerate the 36 template assets.
</commit_message>
<xml_diff>
--- a/src/briefloop/template_assets/academic-paper-zh-t1.docx
+++ b/src/briefloop/template_assets/academic-paper-zh-t1.docx
@@ -159,15 +159,15 @@
     <w:tbl>
       <w:tblPr>
         <w:tblW w:type="auto" w:w="0"/>
-        <w:tblLook w:firstColumn="1" w:firstRow="1" w:lastColumn="0" w:lastRow="0" w:noHBand="0" w:noVBand="1" w:val="04A0"/>
         <w:tblBorders>
           <w:top w:val="single" w:sz="12" w:color="1E2320"/>
+          <w:left w:val="none" w:sz="0" w:color="1E2320"/>
           <w:bottom w:val="single" w:sz="12" w:color="1E2320"/>
-          <w:left w:val="none" w:sz="0" w:color="1E2320"/>
           <w:right w:val="none" w:sz="0" w:color="1E2320"/>
           <w:insideH w:val="none" w:sz="0" w:color="1E2320"/>
           <w:insideV w:val="none" w:sz="0" w:color="1E2320"/>
         </w:tblBorders>
+        <w:tblLook w:firstColumn="1" w:firstRow="1" w:lastColumn="0" w:lastRow="0" w:noHBand="0" w:noVBand="1" w:val="04A0"/>
       </w:tblPr>
       <w:tblGrid>
         <w:gridCol w:w="2880"/>

</xml_diff>

<commit_message>
feat: implement BriefLoop design v3.1 and provenance-aware exports
</commit_message>
<xml_diff>
--- a/src/briefloop/template_assets/academic-paper-zh-t1.docx
+++ b/src/briefloop/template_assets/academic-paper-zh-t1.docx
@@ -27,7 +27,7 @@
         <w:rPr>
           <w:rFonts w:ascii="Arial" w:hAnsi="Arial" w:eastAsia="黑体"/>
           <w:b/>
-          <w:color w:val="006838"/>
+          <w:color w:val="2448B8"/>
           <w:sz w:val="40"/>
         </w:rPr>
         <w:t>{{title}}</w:t>
@@ -61,7 +61,7 @@
         <w:rPr>
           <w:rFonts w:ascii="Arial" w:hAnsi="Arial" w:eastAsia="黑体"/>
           <w:b/>
-          <w:color w:val="006838"/>
+          <w:color w:val="2448B8"/>
           <w:sz w:val="30"/>
         </w:rPr>
         <w:t>摘要</w:t>
@@ -75,7 +75,7 @@
         <w:rPr>
           <w:rFonts w:ascii="Arial" w:hAnsi="Arial" w:eastAsia="黑体"/>
           <w:b/>
-          <w:color w:val="006838"/>
+          <w:color w:val="2448B8"/>
           <w:sz w:val="30"/>
         </w:rPr>
         <w:t>引言</w:t>
@@ -89,7 +89,7 @@
         <w:rPr>
           <w:rFonts w:ascii="Arial" w:hAnsi="Arial" w:eastAsia="黑体"/>
           <w:b/>
-          <w:color w:val="006838"/>
+          <w:color w:val="2448B8"/>
           <w:sz w:val="30"/>
         </w:rPr>
         <w:t>研究方法</w:t>
@@ -103,7 +103,7 @@
         <w:rPr>
           <w:rFonts w:ascii="Arial" w:hAnsi="Arial" w:eastAsia="黑体"/>
           <w:b/>
-          <w:color w:val="006838"/>
+          <w:color w:val="2448B8"/>
           <w:sz w:val="30"/>
         </w:rPr>
         <w:t>结果</w:t>
@@ -117,7 +117,7 @@
         <w:rPr>
           <w:rFonts w:ascii="Arial" w:hAnsi="Arial" w:eastAsia="黑体"/>
           <w:b/>
-          <w:color w:val="006838"/>
+          <w:color w:val="2448B8"/>
           <w:sz w:val="30"/>
         </w:rPr>
         <w:t>讨论</w:t>
@@ -131,7 +131,7 @@
         <w:rPr>
           <w:rFonts w:ascii="Arial" w:hAnsi="Arial" w:eastAsia="黑体"/>
           <w:b/>
-          <w:color w:val="006838"/>
+          <w:color w:val="2448B8"/>
           <w:sz w:val="30"/>
         </w:rPr>
         <w:t>结论</w:t>
@@ -145,7 +145,7 @@
         <w:rPr>
           <w:rFonts w:ascii="Arial" w:hAnsi="Arial" w:eastAsia="黑体"/>
           <w:b/>
-          <w:color w:val="006838"/>
+          <w:color w:val="2448B8"/>
           <w:sz w:val="30"/>
         </w:rPr>
         <w:t>参考文献</w:t>
@@ -788,7 +788,7 @@
       <w:rFonts w:asciiTheme="majorHAnsi" w:eastAsiaTheme="majorEastAsia" w:hAnsiTheme="majorHAnsi" w:cstheme="majorBidi" w:ascii="Arial" w:hAnsi="Arial" w:eastAsia="黑体"/>
       <w:b/>
       <w:bCs/>
-      <w:color w:val="006838"/>
+      <w:color w:val="2448B8"/>
       <w:sz w:val="30"/>
       <w:szCs w:val="28"/>
     </w:rPr>
@@ -812,7 +812,7 @@
       <w:rFonts w:asciiTheme="majorHAnsi" w:eastAsiaTheme="majorEastAsia" w:hAnsiTheme="majorHAnsi" w:cstheme="majorBidi" w:ascii="Arial" w:hAnsi="Arial" w:eastAsia="黑体"/>
       <w:b/>
       <w:bCs/>
-      <w:color w:val="006838"/>
+      <w:color w:val="2448B8"/>
       <w:sz w:val="25"/>
       <w:szCs w:val="26"/>
     </w:rPr>

</xml_diff>